<commit_message>
feat(kafa): added schema registration properly
</commit_message>
<xml_diff>
--- a/oms design doc.docx
+++ b/oms design doc.docx
@@ -226,7 +226,15 @@
           </w:tcPr>
           <w:p>
             <w:r>
-              <w:t>Shared domain models (Order, Trade, Instrument), enums, DTOs</w:t>
+              <w:t xml:space="preserve">Shared domain models (Order, Trade, Instrument), </w:t>
+            </w:r>
+            <w:proofErr w:type="spellStart"/>
+            <w:r>
+              <w:t>enums</w:t>
+            </w:r>
+            <w:proofErr w:type="spellEnd"/>
+            <w:r>
+              <w:t>, DTOs</w:t>
             </w:r>
           </w:p>
         </w:tc>
@@ -359,7 +367,15 @@
           </w:tcPr>
           <w:p>
             <w:r>
-              <w:t>oms-api-gateway</w:t>
+              <w:t>oms-</w:t>
+            </w:r>
+            <w:proofErr w:type="spellStart"/>
+            <w:r>
+              <w:t>api</w:t>
+            </w:r>
+            <w:proofErr w:type="spellEnd"/>
+            <w:r>
+              <w:t>-gateway</w:t>
             </w:r>
           </w:p>
         </w:tc>
@@ -708,7 +724,15 @@
     </w:p>
     <w:p>
       <w:r>
-        <w:t xml:space="preserve">   [Database]      [Admin Service]</w:t>
+        <w:t xml:space="preserve">   [</w:t>
+      </w:r>
+      <w:proofErr w:type="gramStart"/>
+      <w:r>
+        <w:t>Database]      [</w:t>
+      </w:r>
+      <w:proofErr w:type="gramEnd"/>
+      <w:r>
+        <w:t>Admin Service]</w:t>
       </w:r>
     </w:p>
     <w:p>
@@ -1349,7 +1373,23 @@
           <w:b/>
           <w:bCs/>
         </w:rPr>
-        <w:t xml:space="preserve"> 1. Emit TradeExecutedEvent for Downstream Services</w:t>
+        <w:t xml:space="preserve"> 1. Emit </w:t>
+      </w:r>
+      <w:proofErr w:type="spellStart"/>
+      <w:r>
+        <w:rPr>
+          <w:b/>
+          <w:bCs/>
+        </w:rPr>
+        <w:t>TradeExecutedEvent</w:t>
+      </w:r>
+      <w:proofErr w:type="spellEnd"/>
+      <w:r>
+        <w:rPr>
+          <w:b/>
+          <w:bCs/>
+        </w:rPr>
+        <w:t xml:space="preserve"> for Downstream Services</w:t>
       </w:r>
     </w:p>
     <w:p>
@@ -1453,23 +1493,99 @@
     </w:p>
     <w:p>
       <w:r>
-        <w:t>public class TradeExecutedEvent {</w:t>
-      </w:r>
-    </w:p>
-    <w:p>
-      <w:r>
-        <w:t xml:space="preserve">    private final Trade trade;</w:t>
-      </w:r>
-    </w:p>
-    <w:p>
-      <w:r>
-        <w:t xml:space="preserve">    public TradeExecutedEvent(Trade trade) { this.trade = trade; }</w:t>
-      </w:r>
-    </w:p>
-    <w:p>
-      <w:r>
-        <w:t xml:space="preserve">    public Trade getTrade() { return trade; }</w:t>
-      </w:r>
+        <w:t xml:space="preserve">public class </w:t>
+      </w:r>
+      <w:proofErr w:type="spellStart"/>
+      <w:r>
+        <w:t>TradeExecutedEvent</w:t>
+      </w:r>
+      <w:proofErr w:type="spellEnd"/>
+      <w:r>
+        <w:t xml:space="preserve"> {</w:t>
+      </w:r>
+    </w:p>
+    <w:p>
+      <w:r>
+        <w:t xml:space="preserve">    private final Trade </w:t>
+      </w:r>
+      <w:proofErr w:type="spellStart"/>
+      <w:r>
+        <w:t>trade</w:t>
+      </w:r>
+      <w:proofErr w:type="spellEnd"/>
+      <w:r>
+        <w:t>;</w:t>
+      </w:r>
+    </w:p>
+    <w:p>
+      <w:r>
+        <w:t xml:space="preserve">    public </w:t>
+      </w:r>
+      <w:proofErr w:type="spellStart"/>
+      <w:proofErr w:type="gramStart"/>
+      <w:r>
+        <w:t>TradeExecutedEvent</w:t>
+      </w:r>
+      <w:proofErr w:type="spellEnd"/>
+      <w:r>
+        <w:t>(</w:t>
+      </w:r>
+      <w:proofErr w:type="gramEnd"/>
+      <w:r>
+        <w:t xml:space="preserve">Trade trade) </w:t>
+      </w:r>
+      <w:proofErr w:type="gramStart"/>
+      <w:r>
+        <w:t xml:space="preserve">{ </w:t>
+      </w:r>
+      <w:proofErr w:type="spellStart"/>
+      <w:r>
+        <w:t>this</w:t>
+      </w:r>
+      <w:proofErr w:type="gramEnd"/>
+      <w:r>
+        <w:t>.trade</w:t>
+      </w:r>
+      <w:proofErr w:type="spellEnd"/>
+      <w:r>
+        <w:t xml:space="preserve"> = trade</w:t>
+      </w:r>
+      <w:proofErr w:type="gramStart"/>
+      <w:r>
+        <w:t>; }</w:t>
+      </w:r>
+      <w:proofErr w:type="gramEnd"/>
+    </w:p>
+    <w:p>
+      <w:r>
+        <w:t xml:space="preserve">    public Trade </w:t>
+      </w:r>
+      <w:proofErr w:type="spellStart"/>
+      <w:proofErr w:type="gramStart"/>
+      <w:r>
+        <w:t>getTrade</w:t>
+      </w:r>
+      <w:proofErr w:type="spellEnd"/>
+      <w:r>
+        <w:t>(</w:t>
+      </w:r>
+      <w:proofErr w:type="gramEnd"/>
+      <w:r>
+        <w:t xml:space="preserve">) </w:t>
+      </w:r>
+      <w:proofErr w:type="gramStart"/>
+      <w:r>
+        <w:t>{ return</w:t>
+      </w:r>
+      <w:proofErr w:type="gramEnd"/>
+      <w:r>
+        <w:t xml:space="preserve"> trade</w:t>
+      </w:r>
+      <w:proofErr w:type="gramStart"/>
+      <w:r>
+        <w:t>; }</w:t>
+      </w:r>
+      <w:proofErr w:type="gramEnd"/>
     </w:p>
     <w:p>
       <w:r>
@@ -1488,13 +1604,50 @@
     </w:p>
     <w:p>
       <w:r>
-        <w:t>private ApplicationEventPublisher eventPublisher;</w:t>
+        <w:t xml:space="preserve">private </w:t>
+      </w:r>
+      <w:proofErr w:type="spellStart"/>
+      <w:r>
+        <w:t>ApplicationEventPublisher</w:t>
+      </w:r>
+      <w:proofErr w:type="spellEnd"/>
+      <w:r>
+        <w:t xml:space="preserve"> </w:t>
+      </w:r>
+      <w:proofErr w:type="spellStart"/>
+      <w:r>
+        <w:t>eventPublisher</w:t>
+      </w:r>
+      <w:proofErr w:type="spellEnd"/>
+      <w:r>
+        <w:t>;</w:t>
       </w:r>
     </w:p>
     <w:p/>
     <w:p>
-      <w:r>
-        <w:t>eventPublisher.publishEvent(new TradeExecutedEvent(savedTrade));</w:t>
+      <w:proofErr w:type="spellStart"/>
+      <w:r>
+        <w:t>eventPublisher.publishEvent</w:t>
+      </w:r>
+      <w:proofErr w:type="spellEnd"/>
+      <w:r>
+        <w:t xml:space="preserve">(new </w:t>
+      </w:r>
+      <w:proofErr w:type="spellStart"/>
+      <w:r>
+        <w:t>TradeExecutedEvent</w:t>
+      </w:r>
+      <w:proofErr w:type="spellEnd"/>
+      <w:r>
+        <w:t>(</w:t>
+      </w:r>
+      <w:proofErr w:type="spellStart"/>
+      <w:r>
+        <w:t>savedTrade</w:t>
+      </w:r>
+      <w:proofErr w:type="spellEnd"/>
+      <w:r>
+        <w:t>));</w:t>
       </w:r>
     </w:p>
     <w:p>
@@ -1509,7 +1662,25 @@
     </w:p>
     <w:p>
       <w:r>
-        <w:t>public void handleTradeExecuted(TradeExecutedEvent event) {</w:t>
+        <w:t xml:space="preserve">public void </w:t>
+      </w:r>
+      <w:proofErr w:type="spellStart"/>
+      <w:proofErr w:type="gramStart"/>
+      <w:r>
+        <w:t>handleTradeExecuted</w:t>
+      </w:r>
+      <w:proofErr w:type="spellEnd"/>
+      <w:r>
+        <w:t>(</w:t>
+      </w:r>
+      <w:proofErr w:type="spellStart"/>
+      <w:proofErr w:type="gramEnd"/>
+      <w:r>
+        <w:t>TradeExecutedEvent</w:t>
+      </w:r>
+      <w:proofErr w:type="spellEnd"/>
+      <w:r>
+        <w:t xml:space="preserve"> event) {</w:t>
       </w:r>
     </w:p>
     <w:p>
@@ -1554,7 +1725,39 @@
           <w:b/>
           <w:bCs/>
         </w:rPr>
-        <w:t xml:space="preserve"> 2. Return Both OrderResponseDto and TradeResponseDto in a Wrapper</w:t>
+        <w:t xml:space="preserve"> 2. Return Both </w:t>
+      </w:r>
+      <w:proofErr w:type="spellStart"/>
+      <w:r>
+        <w:rPr>
+          <w:b/>
+          <w:bCs/>
+        </w:rPr>
+        <w:t>OrderResponseDto</w:t>
+      </w:r>
+      <w:proofErr w:type="spellEnd"/>
+      <w:r>
+        <w:rPr>
+          <w:b/>
+          <w:bCs/>
+        </w:rPr>
+        <w:t xml:space="preserve"> and </w:t>
+      </w:r>
+      <w:proofErr w:type="spellStart"/>
+      <w:r>
+        <w:rPr>
+          <w:b/>
+          <w:bCs/>
+        </w:rPr>
+        <w:t>TradeResponseDto</w:t>
+      </w:r>
+      <w:proofErr w:type="spellEnd"/>
+      <w:r>
+        <w:rPr>
+          <w:b/>
+          <w:bCs/>
+        </w:rPr>
+        <w:t xml:space="preserve"> in a Wrapper</w:t>
       </w:r>
     </w:p>
     <w:p>
@@ -1632,17 +1835,41 @@
     </w:p>
     <w:p>
       <w:r>
-        <w:t>public class OrderTradeResponseDto {</w:t>
-      </w:r>
-    </w:p>
-    <w:p>
-      <w:r>
-        <w:t xml:space="preserve">    private OrderResponseDto order;</w:t>
-      </w:r>
-    </w:p>
-    <w:p>
-      <w:r>
-        <w:t xml:space="preserve">    private TradeResponseDto trade;</w:t>
+        <w:t xml:space="preserve">public class </w:t>
+      </w:r>
+      <w:proofErr w:type="spellStart"/>
+      <w:r>
+        <w:t>OrderTradeResponseDto</w:t>
+      </w:r>
+      <w:proofErr w:type="spellEnd"/>
+      <w:r>
+        <w:t xml:space="preserve"> {</w:t>
+      </w:r>
+    </w:p>
+    <w:p>
+      <w:r>
+        <w:t xml:space="preserve">    private </w:t>
+      </w:r>
+      <w:proofErr w:type="spellStart"/>
+      <w:r>
+        <w:t>OrderResponseDto</w:t>
+      </w:r>
+      <w:proofErr w:type="spellEnd"/>
+      <w:r>
+        <w:t xml:space="preserve"> order;</w:t>
+      </w:r>
+    </w:p>
+    <w:p>
+      <w:r>
+        <w:t xml:space="preserve">    private </w:t>
+      </w:r>
+      <w:proofErr w:type="spellStart"/>
+      <w:r>
+        <w:t>TradeResponseDto</w:t>
+      </w:r>
+      <w:proofErr w:type="spellEnd"/>
+      <w:r>
+        <w:t xml:space="preserve"> trade;</w:t>
       </w:r>
     </w:p>
     <w:p>
@@ -1662,22 +1889,109 @@
     </w:p>
     <w:p>
       <w:r>
-        <w:t>public OrderTradeResponseDto placeOrder(@Valid @RequestBody OrderRequestDto requestDto) {</w:t>
-      </w:r>
-    </w:p>
-    <w:p>
-      <w:r>
-        <w:t xml:space="preserve">    Order order = ...;</w:t>
-      </w:r>
-    </w:p>
-    <w:p>
-      <w:r>
-        <w:t xml:space="preserve">    Trade trade = tradeService.executeTrade(order);</w:t>
-      </w:r>
-    </w:p>
-    <w:p>
-      <w:r>
-        <w:t xml:space="preserve">    return new OrderTradeResponseDto(orderMapper.toResponseDto(order), tradeMapper.toResponseDto(trade));</w:t>
+        <w:t xml:space="preserve">public </w:t>
+      </w:r>
+      <w:proofErr w:type="spellStart"/>
+      <w:r>
+        <w:t>OrderTradeResponseDto</w:t>
+      </w:r>
+      <w:proofErr w:type="spellEnd"/>
+      <w:r>
+        <w:t xml:space="preserve"> </w:t>
+      </w:r>
+      <w:proofErr w:type="spellStart"/>
+      <w:proofErr w:type="gramStart"/>
+      <w:r>
+        <w:t>placeOrder</w:t>
+      </w:r>
+      <w:proofErr w:type="spellEnd"/>
+      <w:r>
+        <w:t>(</w:t>
+      </w:r>
+      <w:proofErr w:type="gramEnd"/>
+      <w:r>
+        <w:t xml:space="preserve">@Valid @RequestBody </w:t>
+      </w:r>
+      <w:proofErr w:type="spellStart"/>
+      <w:r>
+        <w:t>OrderRequestDto</w:t>
+      </w:r>
+      <w:proofErr w:type="spellEnd"/>
+      <w:r>
+        <w:t xml:space="preserve"> </w:t>
+      </w:r>
+      <w:proofErr w:type="spellStart"/>
+      <w:r>
+        <w:t>requestDto</w:t>
+      </w:r>
+      <w:proofErr w:type="spellEnd"/>
+      <w:r>
+        <w:t>) {</w:t>
+      </w:r>
+    </w:p>
+    <w:p>
+      <w:r>
+        <w:t xml:space="preserve">    Order </w:t>
+      </w:r>
+      <w:proofErr w:type="spellStart"/>
+      <w:r>
+        <w:t>order</w:t>
+      </w:r>
+      <w:proofErr w:type="spellEnd"/>
+      <w:r>
+        <w:t xml:space="preserve"> = ...;</w:t>
+      </w:r>
+    </w:p>
+    <w:p>
+      <w:r>
+        <w:t xml:space="preserve">    Trade </w:t>
+      </w:r>
+      <w:proofErr w:type="spellStart"/>
+      <w:r>
+        <w:t>trade</w:t>
+      </w:r>
+      <w:proofErr w:type="spellEnd"/>
+      <w:r>
+        <w:t xml:space="preserve"> = </w:t>
+      </w:r>
+      <w:proofErr w:type="spellStart"/>
+      <w:r>
+        <w:t>tradeService.executeTrade</w:t>
+      </w:r>
+      <w:proofErr w:type="spellEnd"/>
+      <w:r>
+        <w:t>(order);</w:t>
+      </w:r>
+    </w:p>
+    <w:p>
+      <w:r>
+        <w:t xml:space="preserve">    return new </w:t>
+      </w:r>
+      <w:proofErr w:type="spellStart"/>
+      <w:proofErr w:type="gramStart"/>
+      <w:r>
+        <w:t>OrderTradeResponseDto</w:t>
+      </w:r>
+      <w:proofErr w:type="spellEnd"/>
+      <w:r>
+        <w:t>(</w:t>
+      </w:r>
+      <w:proofErr w:type="spellStart"/>
+      <w:proofErr w:type="gramEnd"/>
+      <w:r>
+        <w:t>orderMapper.toResponseDto</w:t>
+      </w:r>
+      <w:proofErr w:type="spellEnd"/>
+      <w:r>
+        <w:t xml:space="preserve">(order), </w:t>
+      </w:r>
+      <w:proofErr w:type="spellStart"/>
+      <w:r>
+        <w:t>tradeMapper.toResponseDto</w:t>
+      </w:r>
+      <w:proofErr w:type="spellEnd"/>
+      <w:r>
+        <w:t>(trade));</w:t>
       </w:r>
     </w:p>
     <w:p>
@@ -1802,42 +2116,158 @@
     </w:p>
     <w:p>
       <w:r>
-        <w:t>Use System.nanoTime() or Instant.now() to measure duration:</w:t>
-      </w:r>
-    </w:p>
-    <w:p>
-      <w:r>
-        <w:t>long start = System.nanoTime();</w:t>
-      </w:r>
-    </w:p>
-    <w:p>
-      <w:r>
-        <w:t>Trade trade = tradeService.executeTrade(order);</w:t>
-      </w:r>
-    </w:p>
-    <w:p>
-      <w:r>
-        <w:t>long end = System.nanoTime();</w:t>
-      </w:r>
-    </w:p>
-    <w:p>
-      <w:r>
-        <w:t>log.info("Trade executed in {} µs", (end - start) / 1000);</w:t>
-      </w:r>
-    </w:p>
-    <w:p>
-      <w:r>
-        <w:t>Or use Spring Actuator + Micrometer to expose metrics:</w:t>
-      </w:r>
-    </w:p>
-    <w:p>
-      <w:r>
-        <w:t>@Timed(value = "trade.execution.time", description = "Time taken to execute trade")</w:t>
-      </w:r>
-    </w:p>
-    <w:p>
-      <w:r>
-        <w:t>public TradeResponseDto executeTrade(Order order) { ... }</w:t>
+        <w:t xml:space="preserve">Use </w:t>
+      </w:r>
+      <w:proofErr w:type="spellStart"/>
+      <w:r>
+        <w:t>System.nanoTime</w:t>
+      </w:r>
+      <w:proofErr w:type="spellEnd"/>
+      <w:r>
+        <w:t xml:space="preserve">() or </w:t>
+      </w:r>
+      <w:proofErr w:type="spellStart"/>
+      <w:proofErr w:type="gramStart"/>
+      <w:r>
+        <w:t>Instant.now</w:t>
+      </w:r>
+      <w:proofErr w:type="spellEnd"/>
+      <w:r>
+        <w:t>(</w:t>
+      </w:r>
+      <w:proofErr w:type="gramEnd"/>
+      <w:r>
+        <w:t>) to measure duration:</w:t>
+      </w:r>
+    </w:p>
+    <w:p>
+      <w:r>
+        <w:t xml:space="preserve">long start = </w:t>
+      </w:r>
+      <w:proofErr w:type="spellStart"/>
+      <w:r>
+        <w:t>System.nanoTime</w:t>
+      </w:r>
+      <w:proofErr w:type="spellEnd"/>
+      <w:r>
+        <w:t>();</w:t>
+      </w:r>
+    </w:p>
+    <w:p>
+      <w:r>
+        <w:t xml:space="preserve">Trade </w:t>
+      </w:r>
+      <w:proofErr w:type="spellStart"/>
+      <w:r>
+        <w:t>trade</w:t>
+      </w:r>
+      <w:proofErr w:type="spellEnd"/>
+      <w:r>
+        <w:t xml:space="preserve"> = </w:t>
+      </w:r>
+      <w:proofErr w:type="spellStart"/>
+      <w:r>
+        <w:t>tradeService.executeTrade</w:t>
+      </w:r>
+      <w:proofErr w:type="spellEnd"/>
+      <w:r>
+        <w:t>(order);</w:t>
+      </w:r>
+    </w:p>
+    <w:p>
+      <w:r>
+        <w:t xml:space="preserve">long end = </w:t>
+      </w:r>
+      <w:proofErr w:type="spellStart"/>
+      <w:r>
+        <w:t>System.nanoTime</w:t>
+      </w:r>
+      <w:proofErr w:type="spellEnd"/>
+      <w:r>
+        <w:t>();</w:t>
+      </w:r>
+    </w:p>
+    <w:p>
+      <w:proofErr w:type="gramStart"/>
+      <w:r>
+        <w:t>log.info(</w:t>
+      </w:r>
+      <w:proofErr w:type="gramEnd"/>
+      <w:r>
+        <w:t>"Trade executed in {} µs", (end - start) / 1000);</w:t>
+      </w:r>
+    </w:p>
+    <w:p>
+      <w:r>
+        <w:t xml:space="preserve">Or use Spring Actuator + </w:t>
+      </w:r>
+      <w:proofErr w:type="spellStart"/>
+      <w:r>
+        <w:t>Micrometer</w:t>
+      </w:r>
+      <w:proofErr w:type="spellEnd"/>
+      <w:r>
+        <w:t xml:space="preserve"> to expose metrics:</w:t>
+      </w:r>
+    </w:p>
+    <w:p>
+      <w:r>
+        <w:t>@</w:t>
+      </w:r>
+      <w:proofErr w:type="gramStart"/>
+      <w:r>
+        <w:t>Timed(</w:t>
+      </w:r>
+      <w:proofErr w:type="gramEnd"/>
+      <w:r>
+        <w:t>value = "</w:t>
+      </w:r>
+      <w:proofErr w:type="spellStart"/>
+      <w:proofErr w:type="gramStart"/>
+      <w:r>
+        <w:t>trade.execution</w:t>
+      </w:r>
+      <w:proofErr w:type="gramEnd"/>
+      <w:r>
+        <w:t>.time</w:t>
+      </w:r>
+      <w:proofErr w:type="spellEnd"/>
+      <w:r>
+        <w:t>", description = "Time taken to execute trade")</w:t>
+      </w:r>
+    </w:p>
+    <w:p>
+      <w:r>
+        <w:t xml:space="preserve">public </w:t>
+      </w:r>
+      <w:proofErr w:type="spellStart"/>
+      <w:r>
+        <w:t>TradeResponseDto</w:t>
+      </w:r>
+      <w:proofErr w:type="spellEnd"/>
+      <w:r>
+        <w:t xml:space="preserve"> </w:t>
+      </w:r>
+      <w:proofErr w:type="spellStart"/>
+      <w:proofErr w:type="gramStart"/>
+      <w:r>
+        <w:t>executeTrade</w:t>
+      </w:r>
+      <w:proofErr w:type="spellEnd"/>
+      <w:r>
+        <w:t>(</w:t>
+      </w:r>
+      <w:proofErr w:type="gramEnd"/>
+      <w:r>
+        <w:t xml:space="preserve">Order order) </w:t>
+      </w:r>
+      <w:proofErr w:type="gramStart"/>
+      <w:r>
+        <w:t>{ ...</w:t>
+      </w:r>
+      <w:proofErr w:type="gramEnd"/>
+      <w:r>
+        <w:t xml:space="preserve"> }</w:t>
       </w:r>
     </w:p>
     <w:p>
@@ -2045,6 +2475,7 @@
       <w:r>
         <w:t xml:space="preserve">Use </w:t>
       </w:r>
+      <w:proofErr w:type="spellStart"/>
       <w:r>
         <w:rPr>
           <w:b/>
@@ -2052,6 +2483,7 @@
         </w:rPr>
         <w:t>gRPC</w:t>
       </w:r>
+      <w:proofErr w:type="spellEnd"/>
       <w:r>
         <w:t xml:space="preserve"> (binary, fast, schema-based)</w:t>
       </w:r>
@@ -2108,7 +2540,15 @@
         </w:numPr>
       </w:pPr>
       <w:r>
-        <w:t>oms-core publishes OrderPlacedEvent to Kafka</w:t>
+        <w:t xml:space="preserve">oms-core publishes </w:t>
+      </w:r>
+      <w:proofErr w:type="spellStart"/>
+      <w:r>
+        <w:t>OrderPlacedEvent</w:t>
+      </w:r>
+      <w:proofErr w:type="spellEnd"/>
+      <w:r>
+        <w:t xml:space="preserve"> to Kafka</w:t>
       </w:r>
     </w:p>
     <w:p>
@@ -2119,8 +2559,13 @@
         </w:numPr>
       </w:pPr>
       <w:r>
-        <w:t>Rust-based oms-matching-engine consumes it, matches, and emits TradeExecutedEvent</w:t>
-      </w:r>
+        <w:t xml:space="preserve">Rust-based oms-matching-engine consumes it, matches, and emits </w:t>
+      </w:r>
+      <w:proofErr w:type="spellStart"/>
+      <w:r>
+        <w:t>TradeExecutedEvent</w:t>
+      </w:r>
+      <w:proofErr w:type="spellEnd"/>
     </w:p>
     <w:p>
       <w:r>
@@ -2326,7 +2771,23 @@
           <w:iCs/>
         </w:rPr>
         <w:lastRenderedPageBreak/>
-        <w:t>Compile Rust into a .dll or .so and call it from Java.</w:t>
+        <w:t>Compile Rust into a .</w:t>
+      </w:r>
+      <w:proofErr w:type="spellStart"/>
+      <w:r>
+        <w:rPr>
+          <w:i/>
+          <w:iCs/>
+        </w:rPr>
+        <w:t>dll</w:t>
+      </w:r>
+      <w:proofErr w:type="spellEnd"/>
+      <w:r>
+        <w:rPr>
+          <w:i/>
+          <w:iCs/>
+        </w:rPr>
+        <w:t xml:space="preserve"> or .so and call it from Java.</w:t>
       </w:r>
     </w:p>
     <w:p>
@@ -2438,7 +2899,23 @@
           <w:b/>
           <w:bCs/>
         </w:rPr>
-        <w:t>4. WebAssembly (Experimental)</w:t>
+        <w:t xml:space="preserve">4. </w:t>
+      </w:r>
+      <w:proofErr w:type="spellStart"/>
+      <w:r>
+        <w:rPr>
+          <w:b/>
+          <w:bCs/>
+        </w:rPr>
+        <w:t>WebAssembly</w:t>
+      </w:r>
+      <w:proofErr w:type="spellEnd"/>
+      <w:r>
+        <w:rPr>
+          <w:b/>
+          <w:bCs/>
+        </w:rPr>
+        <w:t xml:space="preserve"> (Experimental)</w:t>
       </w:r>
     </w:p>
     <w:p>
@@ -2741,8 +3218,13 @@
           </w:tcPr>
           <w:p>
             <w:r>
-              <w:t>Kafka / gRPC</w:t>
+              <w:t xml:space="preserve">Kafka / </w:t>
             </w:r>
+            <w:proofErr w:type="spellStart"/>
+            <w:r>
+              <w:t>gRPC</w:t>
+            </w:r>
+            <w:proofErr w:type="spellEnd"/>
           </w:p>
         </w:tc>
       </w:tr>
@@ -2806,7 +3288,23 @@
         <w:t>Kafka</w:t>
       </w:r>
       <w:r>
-        <w:t xml:space="preserve"> for event-driven flows (OrderPlacedEvent, TradeExecutedEvent)</w:t>
+        <w:t xml:space="preserve"> for event-driven flows (</w:t>
+      </w:r>
+      <w:proofErr w:type="spellStart"/>
+      <w:r>
+        <w:t>OrderPlacedEvent</w:t>
+      </w:r>
+      <w:proofErr w:type="spellEnd"/>
+      <w:r>
+        <w:t xml:space="preserve">, </w:t>
+      </w:r>
+      <w:proofErr w:type="spellStart"/>
+      <w:r>
+        <w:t>TradeExecutedEvent</w:t>
+      </w:r>
+      <w:proofErr w:type="spellEnd"/>
+      <w:r>
+        <w:t>)</w:t>
       </w:r>
     </w:p>
     <w:p>
@@ -2819,6 +3317,7 @@
       <w:r>
         <w:t xml:space="preserve">Use </w:t>
       </w:r>
+      <w:proofErr w:type="spellStart"/>
       <w:r>
         <w:rPr>
           <w:b/>
@@ -2826,6 +3325,7 @@
         </w:rPr>
         <w:t>gRPC</w:t>
       </w:r>
+      <w:proofErr w:type="spellEnd"/>
       <w:r>
         <w:t xml:space="preserve"> if you want fast, schema-based RPC between services</w:t>
       </w:r>
@@ -2869,13 +3369,30 @@
           <w:b/>
           <w:bCs/>
         </w:rPr>
-        <w:t xml:space="preserve"> Bonus: Protobuf for Shared Contracts</w:t>
+        <w:t xml:space="preserve"> Bonus: </w:t>
+      </w:r>
+      <w:proofErr w:type="spellStart"/>
+      <w:r>
+        <w:rPr>
+          <w:b/>
+          <w:bCs/>
+        </w:rPr>
+        <w:t>Protobuf</w:t>
+      </w:r>
+      <w:proofErr w:type="spellEnd"/>
+      <w:r>
+        <w:rPr>
+          <w:b/>
+          <w:bCs/>
+        </w:rPr>
+        <w:t xml:space="preserve"> for Shared Contracts</w:t>
       </w:r>
     </w:p>
     <w:p>
       <w:r>
         <w:t xml:space="preserve">Use </w:t>
       </w:r>
+      <w:proofErr w:type="spellStart"/>
       <w:r>
         <w:rPr>
           <w:b/>
@@ -2883,18 +3400,35 @@
         </w:rPr>
         <w:t>Protobuf</w:t>
       </w:r>
+      <w:proofErr w:type="spellEnd"/>
       <w:r>
         <w:t xml:space="preserve"> to define event schemas:</w:t>
       </w:r>
     </w:p>
     <w:p>
       <w:r>
-        <w:t>message TradeExecutedEvent {</w:t>
-      </w:r>
-    </w:p>
-    <w:p>
-      <w:r>
-        <w:t xml:space="preserve">  int64 tradeId = 1;</w:t>
+        <w:t xml:space="preserve">message </w:t>
+      </w:r>
+      <w:proofErr w:type="spellStart"/>
+      <w:r>
+        <w:t>TradeExecutedEvent</w:t>
+      </w:r>
+      <w:proofErr w:type="spellEnd"/>
+      <w:r>
+        <w:t xml:space="preserve"> {</w:t>
+      </w:r>
+    </w:p>
+    <w:p>
+      <w:r>
+        <w:t xml:space="preserve">  int64 </w:t>
+      </w:r>
+      <w:proofErr w:type="spellStart"/>
+      <w:r>
+        <w:t>tradeId</w:t>
+      </w:r>
+      <w:proofErr w:type="spellEnd"/>
+      <w:r>
+        <w:t xml:space="preserve"> = 1;</w:t>
       </w:r>
     </w:p>
     <w:p>
@@ -2935,8 +3469,13 @@
         </w:numPr>
       </w:pPr>
       <w:r>
-        <w:t>Rust and Java both support Protobuf</w:t>
-      </w:r>
+        <w:t xml:space="preserve">Rust and Java both support </w:t>
+      </w:r>
+      <w:proofErr w:type="spellStart"/>
+      <w:r>
+        <w:t>Protobuf</w:t>
+      </w:r>
+      <w:proofErr w:type="spellEnd"/>
     </w:p>
     <w:p>
       <w:pPr>
@@ -2946,8 +3485,13 @@
         </w:numPr>
       </w:pPr>
       <w:r>
-        <w:t>Keeps your event contracts consistent and versionable</w:t>
-      </w:r>
+        <w:t xml:space="preserve">Keeps your event contracts consistent and </w:t>
+      </w:r>
+      <w:proofErr w:type="spellStart"/>
+      <w:r>
+        <w:t>versionable</w:t>
+      </w:r>
+      <w:proofErr w:type="spellEnd"/>
     </w:p>
     <w:p>
       <w:r>
@@ -2963,7 +3507,15 @@
     </w:p>
     <w:p>
       <w:r>
-        <w:t>Want to sketch out the Protobuf schema for your matching engine next? Or simulate a full event flow from order to trade?</w:t>
+        <w:t xml:space="preserve">Want to sketch out the </w:t>
+      </w:r>
+      <w:proofErr w:type="spellStart"/>
+      <w:r>
+        <w:t>Protobuf</w:t>
+      </w:r>
+      <w:proofErr w:type="spellEnd"/>
+      <w:r>
+        <w:t xml:space="preserve"> schema for your matching engine next? Or simulate a full event flow from order to trade?</w:t>
       </w:r>
     </w:p>
     <w:p>
@@ -3017,7 +3569,7 @@
     <w:p>
       <w:r>
         <w:pict w14:anchorId="4BF37FE0">
-          <v:rect id="_x0000_i1223" style="width:0;height:1.5pt" o:hralign="center" o:hrstd="t" o:hr="t" fillcolor="#a0a0a0" stroked="f"/>
+          <v:rect id="_x0000_i1043" style="width:0;height:1.5pt" o:hralign="center" o:hrstd="t" o:hr="t" fillcolor="#a0a0a0" stroked="f"/>
         </w:pict>
       </w:r>
     </w:p>
@@ -3088,7 +3640,7 @@
     <w:p>
       <w:r>
         <w:pict w14:anchorId="577D91CF">
-          <v:rect id="_x0000_i1224" style="width:0;height:1.5pt" o:hralign="center" o:hrstd="t" o:hr="t" fillcolor="#a0a0a0" stroked="f"/>
+          <v:rect id="_x0000_i1044" style="width:0;height:1.5pt" o:hralign="center" o:hrstd="t" o:hr="t" fillcolor="#a0a0a0" stroked="f"/>
         </w:pict>
       </w:r>
     </w:p>
@@ -3184,7 +3736,15 @@
         <w:t>Publish events</w:t>
       </w:r>
       <w:r>
-        <w:t xml:space="preserve"> (e.g. OrderPlacedEvent) to Kafka for downstream processing</w:t>
+        <w:t xml:space="preserve"> (e.g. </w:t>
+      </w:r>
+      <w:proofErr w:type="spellStart"/>
+      <w:r>
+        <w:t>OrderPlacedEvent</w:t>
+      </w:r>
+      <w:proofErr w:type="spellEnd"/>
+      <w:r>
+        <w:t>) to Kafka for downstream processing</w:t>
       </w:r>
     </w:p>
     <w:p>
@@ -3208,7 +3768,7 @@
     <w:p>
       <w:r>
         <w:pict w14:anchorId="074F9F73">
-          <v:rect id="_x0000_i1225" style="width:0;height:1.5pt" o:hralign="center" o:hrstd="t" o:hr="t" fillcolor="#a0a0a0" stroked="f"/>
+          <v:rect id="_x0000_i1045" style="width:0;height:1.5pt" o:hralign="center" o:hrstd="t" o:hr="t" fillcolor="#a0a0a0" stroked="f"/>
         </w:pict>
       </w:r>
     </w:p>
@@ -3459,7 +4019,15 @@
           </w:tcPr>
           <w:p>
             <w:r>
-              <w:t>oms-api-gateway</w:t>
+              <w:t>oms-</w:t>
+            </w:r>
+            <w:proofErr w:type="spellStart"/>
+            <w:r>
+              <w:t>api</w:t>
+            </w:r>
+            <w:proofErr w:type="spellEnd"/>
+            <w:r>
+              <w:t>-gateway</w:t>
             </w:r>
           </w:p>
         </w:tc>
@@ -3492,7 +4060,7 @@
     <w:p>
       <w:r>
         <w:pict w14:anchorId="14A4ABD0">
-          <v:rect id="_x0000_i1226" style="width:0;height:1.5pt" o:hralign="center" o:hrstd="t" o:hr="t" fillcolor="#a0a0a0" stroked="f"/>
+          <v:rect id="_x0000_i1046" style="width:0;height:1.5pt" o:hralign="center" o:hrstd="t" o:hr="t" fillcolor="#a0a0a0" stroked="f"/>
         </w:pict>
       </w:r>
     </w:p>
@@ -3521,13 +4089,26 @@
     </w:p>
     <w:p>
       <w:r>
-        <w:t>[Client] → [oms-api-gateway] → [oms-order-service]</w:t>
-      </w:r>
-    </w:p>
-    <w:p>
-      <w:r>
-        <w:t xml:space="preserve">    → Publish: OrderPlacedEvent</w:t>
-      </w:r>
+        <w:t>[Client] → [oms-</w:t>
+      </w:r>
+      <w:proofErr w:type="spellStart"/>
+      <w:r>
+        <w:t>api</w:t>
+      </w:r>
+      <w:proofErr w:type="spellEnd"/>
+      <w:r>
+        <w:t>-gateway] → [oms-order-service]</w:t>
+      </w:r>
+    </w:p>
+    <w:p>
+      <w:r>
+        <w:t xml:space="preserve">    → Publish: </w:t>
+      </w:r>
+      <w:proofErr w:type="spellStart"/>
+      <w:r>
+        <w:t>OrderPlacedEvent</w:t>
+      </w:r>
+      <w:proofErr w:type="spellEnd"/>
     </w:p>
     <w:p>
       <w:r>
@@ -3536,8 +4117,13 @@
     </w:p>
     <w:p>
       <w:r>
-        <w:t xml:space="preserve">            → Publish: RiskApprovedEvent</w:t>
-      </w:r>
+        <w:t xml:space="preserve">            → Publish: </w:t>
+      </w:r>
+      <w:proofErr w:type="spellStart"/>
+      <w:r>
+        <w:t>RiskApprovedEvent</w:t>
+      </w:r>
+      <w:proofErr w:type="spellEnd"/>
     </w:p>
     <w:p>
       <w:r>
@@ -3546,8 +4132,13 @@
     </w:p>
     <w:p>
       <w:r>
-        <w:t xml:space="preserve">                    → Publish: TradeExecutedEvent</w:t>
-      </w:r>
+        <w:t xml:space="preserve">                    → Publish: </w:t>
+      </w:r>
+      <w:proofErr w:type="spellStart"/>
+      <w:r>
+        <w:t>TradeExecutedEvent</w:t>
+      </w:r>
+      <w:proofErr w:type="spellEnd"/>
     </w:p>
     <w:p>
       <w:r>
@@ -3557,7 +4148,7 @@
     <w:p>
       <w:r>
         <w:pict w14:anchorId="0C600469">
-          <v:rect id="_x0000_i1227" style="width:0;height:1.5pt" o:hralign="center" o:hrstd="t" o:hr="t" fillcolor="#a0a0a0" stroked="f"/>
+          <v:rect id="_x0000_i1047" style="width:0;height:1.5pt" o:hralign="center" o:hrstd="t" o:hr="t" fillcolor="#a0a0a0" stroked="f"/>
         </w:pict>
       </w:r>
     </w:p>
@@ -3597,8 +4188,17 @@
           <w:bCs/>
         </w:rPr>
         <w:lastRenderedPageBreak/>
-        <w:t>Swagger/OpenAPI</w:t>
-      </w:r>
+        <w:t>Swagger/</w:t>
+      </w:r>
+      <w:proofErr w:type="spellStart"/>
+      <w:r>
+        <w:rPr>
+          <w:b/>
+          <w:bCs/>
+        </w:rPr>
+        <w:t>OpenAPI</w:t>
+      </w:r>
+      <w:proofErr w:type="spellEnd"/>
       <w:r>
         <w:t xml:space="preserve"> for API documentation</w:t>
       </w:r>
@@ -3678,7 +4278,7 @@
     <w:p>
       <w:r>
         <w:pict w14:anchorId="5A95EC50">
-          <v:rect id="_x0000_i1228" style="width:0;height:1.5pt" o:hralign="center" o:hrstd="t" o:hr="t" fillcolor="#a0a0a0" stroked="f"/>
+          <v:rect id="_x0000_i1048" style="width:0;height:1.5pt" o:hralign="center" o:hrstd="t" o:hr="t" fillcolor="#a0a0a0" stroked="f"/>
         </w:pict>
       </w:r>
     </w:p>
@@ -3732,7 +4332,15 @@
         <w:t>event payload</w:t>
       </w:r>
       <w:r>
-        <w:t xml:space="preserve"> for OrderPlacedEvent, or scaffold the controller and service layer. You’re building this like someone who knows that clarity at the edges leads to strength at the core.</w:t>
+        <w:t xml:space="preserve"> for </w:t>
+      </w:r>
+      <w:proofErr w:type="spellStart"/>
+      <w:r>
+        <w:t>OrderPlacedEvent</w:t>
+      </w:r>
+      <w:proofErr w:type="spellEnd"/>
+      <w:r>
+        <w:t>, or scaffold the controller and service layer. You’re building this like someone who knows that clarity at the edges leads to strength at the core.</w:t>
       </w:r>
     </w:p>
     <w:p>
@@ -3746,6 +4354,80 @@
       </w:pPr>
       <w:r>
         <w:br/>
+      </w:r>
+      <w:r>
+        <w:rPr>
+          <w:b/>
+          <w:bCs/>
+          <w:sz w:val="32"/>
+          <w:szCs w:val="32"/>
+        </w:rPr>
+        <w:br/>
+      </w:r>
+      <w:proofErr w:type="spellStart"/>
+      <w:r>
+        <w:rPr>
+          <w:b/>
+          <w:bCs/>
+          <w:sz w:val="32"/>
+          <w:szCs w:val="32"/>
+        </w:rPr>
+        <w:t>kafka</w:t>
+      </w:r>
+      <w:proofErr w:type="spellEnd"/>
+    </w:p>
+    <w:p>
+      <w:pPr>
+        <w:rPr>
+          <w:b/>
+          <w:bCs/>
+          <w:sz w:val="32"/>
+          <w:szCs w:val="32"/>
+        </w:rPr>
+      </w:pPr>
+      <w:r>
+        <w:rPr>
+          <w:b/>
+          <w:bCs/>
+          <w:sz w:val="32"/>
+          <w:szCs w:val="32"/>
+        </w:rPr>
+        <w:lastRenderedPageBreak/>
+        <w:drawing>
+          <wp:inline distT="0" distB="0" distL="0" distR="0" wp14:anchorId="5A2E625F" wp14:editId="2A286241">
+            <wp:extent cx="5731510" cy="8681085"/>
+            <wp:effectExtent l="0" t="0" r="2540" b="5715"/>
+            <wp:docPr id="1727920971" name="Picture 1"/>
+            <wp:cNvGraphicFramePr>
+              <a:graphicFrameLocks xmlns:a="http://schemas.openxmlformats.org/drawingml/2006/main" noChangeAspect="1"/>
+            </wp:cNvGraphicFramePr>
+            <a:graphic xmlns:a="http://schemas.openxmlformats.org/drawingml/2006/main">
+              <a:graphicData uri="http://schemas.openxmlformats.org/drawingml/2006/picture">
+                <pic:pic xmlns:pic="http://schemas.openxmlformats.org/drawingml/2006/picture">
+                  <pic:nvPicPr>
+                    <pic:cNvPr id="1727920971" name=""/>
+                    <pic:cNvPicPr/>
+                  </pic:nvPicPr>
+                  <pic:blipFill>
+                    <a:blip r:embed="rId7"/>
+                    <a:stretch>
+                      <a:fillRect/>
+                    </a:stretch>
+                  </pic:blipFill>
+                  <pic:spPr>
+                    <a:xfrm>
+                      <a:off x="0" y="0"/>
+                      <a:ext cx="5731510" cy="8681085"/>
+                    </a:xfrm>
+                    <a:prstGeom prst="rect">
+                      <a:avLst/>
+                    </a:prstGeom>
+                  </pic:spPr>
+                </pic:pic>
+              </a:graphicData>
+            </a:graphic>
+          </wp:inline>
+        </w:drawing>
       </w:r>
     </w:p>
     <w:sectPr>
@@ -7526,6 +8208,7 @@
   <w:style w:type="character" w:default="1" w:styleId="DefaultParagraphFont">
     <w:name w:val="Default Paragraph Font"/>
     <w:uiPriority w:val="1"/>
+    <w:semiHidden/>
     <w:unhideWhenUsed/>
   </w:style>
   <w:style w:type="table" w:default="1" w:styleId="TableNormal">

</xml_diff>